<commit_message>
orchestration model routing working basic Agentic AI features added
</commit_message>
<xml_diff>
--- a/Documentation/Relevant screenshots.docx
+++ b/Documentation/Relevant screenshots.docx
@@ -107,7 +107,15 @@
     <w:p>
       <w:r>
         <w:lastRenderedPageBreak/>
-        <w:t>/documents/process/{document_id}</w:t>
+        <w:t>/documents/process/{</w:t>
+      </w:r>
+      <w:proofErr w:type="spellStart"/>
+      <w:r>
+        <w:t>document_id</w:t>
+      </w:r>
+      <w:proofErr w:type="spellEnd"/>
+      <w:r>
+        <w:t>}</w:t>
       </w:r>
     </w:p>
     <w:p>
@@ -207,7 +215,15 @@
     <w:p/>
     <w:p>
       <w:r>
-        <w:t>/documents/chunk/{document_id}</w:t>
+        <w:t>/documents/chunk/{</w:t>
+      </w:r>
+      <w:proofErr w:type="spellStart"/>
+      <w:r>
+        <w:t>document_id</w:t>
+      </w:r>
+      <w:proofErr w:type="spellEnd"/>
+      <w:r>
+        <w:t>}</w:t>
       </w:r>
     </w:p>
     <w:p>
@@ -223,22 +239,49 @@
         <w:t>embed</w:t>
       </w:r>
       <w:r>
-        <w:t>/{document_id}</w:t>
-      </w:r>
-      <w:r>
-        <w:t xml:space="preserve"> successful response are too big so attached response json along with this file</w:t>
+        <w:t>/{</w:t>
+      </w:r>
+      <w:proofErr w:type="spellStart"/>
+      <w:r>
+        <w:t>document_id</w:t>
+      </w:r>
+      <w:proofErr w:type="spellEnd"/>
+      <w:r>
+        <w:t>}</w:t>
+      </w:r>
+      <w:r>
+        <w:t xml:space="preserve"> successful response are too big so attached response </w:t>
+      </w:r>
+      <w:proofErr w:type="spellStart"/>
+      <w:r>
+        <w:t>json</w:t>
+      </w:r>
+      <w:proofErr w:type="spellEnd"/>
+      <w:r>
+        <w:t xml:space="preserve"> along with this file</w:t>
       </w:r>
     </w:p>
     <w:p/>
     <w:p>
       <w:r>
-        <w:t>Successful model response is also attached as a saved pdf of streamlit UI.</w:t>
+        <w:t xml:space="preserve">Successful model response is also attached as a saved pdf of </w:t>
+      </w:r>
+      <w:proofErr w:type="spellStart"/>
+      <w:r>
+        <w:t>streamlit</w:t>
+      </w:r>
+      <w:proofErr w:type="spellEnd"/>
+      <w:r>
+        <w:t xml:space="preserve"> UI.</w:t>
       </w:r>
     </w:p>
     <w:p/>
     <w:p/>
     <w:p>
       <w:r>
+        <w:rPr>
+          <w:noProof/>
+        </w:rPr>
         <w:lastRenderedPageBreak/>
         <w:drawing>
           <wp:inline distT="0" distB="0" distL="0" distR="0" wp14:anchorId="1E7C0C9E" wp14:editId="2C45BBBB">
@@ -283,6 +326,9 @@
     <w:p/>
     <w:p>
       <w:r>
+        <w:rPr>
+          <w:noProof/>
+        </w:rPr>
         <w:drawing>
           <wp:inline distT="0" distB="0" distL="0" distR="0" wp14:anchorId="1D1505D6" wp14:editId="5BF7464F">
             <wp:extent cx="5731510" cy="3041015"/>
@@ -321,6 +367,96 @@
       </w:r>
       <w:r>
         <w:t>safe prompt working properly</w:t>
+      </w:r>
+    </w:p>
+    <w:p/>
+    <w:p>
+      <w:r>
+        <w:rPr>
+          <w:noProof/>
+        </w:rPr>
+        <w:lastRenderedPageBreak/>
+        <w:drawing>
+          <wp:inline distT="0" distB="0" distL="0" distR="0" wp14:anchorId="0192A242" wp14:editId="4611D72A">
+            <wp:extent cx="5731510" cy="2797810"/>
+            <wp:effectExtent l="0" t="0" r="2540" b="2540"/>
+            <wp:docPr id="850792508" name="Picture 1"/>
+            <wp:cNvGraphicFramePr>
+              <a:graphicFrameLocks xmlns:a="http://schemas.openxmlformats.org/drawingml/2006/main" noChangeAspect="1"/>
+            </wp:cNvGraphicFramePr>
+            <a:graphic xmlns:a="http://schemas.openxmlformats.org/drawingml/2006/main">
+              <a:graphicData uri="http://schemas.openxmlformats.org/drawingml/2006/picture">
+                <pic:pic xmlns:pic="http://schemas.openxmlformats.org/drawingml/2006/picture">
+                  <pic:nvPicPr>
+                    <pic:cNvPr id="850792508" name=""/>
+                    <pic:cNvPicPr/>
+                  </pic:nvPicPr>
+                  <pic:blipFill>
+                    <a:blip r:embed="rId10"/>
+                    <a:stretch>
+                      <a:fillRect/>
+                    </a:stretch>
+                  </pic:blipFill>
+                  <pic:spPr>
+                    <a:xfrm>
+                      <a:off x="0" y="0"/>
+                      <a:ext cx="5731510" cy="2797810"/>
+                    </a:xfrm>
+                    <a:prstGeom prst="rect">
+                      <a:avLst/>
+                    </a:prstGeom>
+                  </pic:spPr>
+                </pic:pic>
+              </a:graphicData>
+            </a:graphic>
+          </wp:inline>
+        </w:drawing>
+      </w:r>
+      <w:r>
+        <w:t>service.py fallback is working</w:t>
+      </w:r>
+    </w:p>
+    <w:p/>
+    <w:p>
+      <w:r>
+        <w:drawing>
+          <wp:inline distT="0" distB="0" distL="0" distR="0" wp14:anchorId="0A39EF25" wp14:editId="4E9D703F">
+            <wp:extent cx="5731510" cy="3352165"/>
+            <wp:effectExtent l="0" t="0" r="2540" b="635"/>
+            <wp:docPr id="1242241552" name="Picture 1"/>
+            <wp:cNvGraphicFramePr>
+              <a:graphicFrameLocks xmlns:a="http://schemas.openxmlformats.org/drawingml/2006/main" noChangeAspect="1"/>
+            </wp:cNvGraphicFramePr>
+            <a:graphic xmlns:a="http://schemas.openxmlformats.org/drawingml/2006/main">
+              <a:graphicData uri="http://schemas.openxmlformats.org/drawingml/2006/picture">
+                <pic:pic xmlns:pic="http://schemas.openxmlformats.org/drawingml/2006/picture">
+                  <pic:nvPicPr>
+                    <pic:cNvPr id="1242241552" name=""/>
+                    <pic:cNvPicPr/>
+                  </pic:nvPicPr>
+                  <pic:blipFill>
+                    <a:blip r:embed="rId11"/>
+                    <a:stretch>
+                      <a:fillRect/>
+                    </a:stretch>
+                  </pic:blipFill>
+                  <pic:spPr>
+                    <a:xfrm>
+                      <a:off x="0" y="0"/>
+                      <a:ext cx="5731510" cy="3352165"/>
+                    </a:xfrm>
+                    <a:prstGeom prst="rect">
+                      <a:avLst/>
+                    </a:prstGeom>
+                  </pic:spPr>
+                </pic:pic>
+              </a:graphicData>
+            </a:graphic>
+          </wp:inline>
+        </w:drawing>
+      </w:r>
+      <w:r>
+        <w:t>orchestrator Model routing is working</w:t>
       </w:r>
     </w:p>
     <w:sectPr>

</xml_diff>